<commit_message>
feat(celsis): update OOS-262017 tables with Terribacillus goriensis microbial ID and direct EagleTrax link
</commit_message>
<xml_diff>
--- a/scratch/Celsis table OOS-262017.docx
+++ b/scratch/Celsis table OOS-262017.docx
@@ -321,21 +321,20 @@
           </w:tcPr>
           <w:p>
             <w:pPr>
-              <w:spacing w:line="360" w:lineRule="auto"/>
-              <w:jc w:val="center"/>
-              <w:rPr>
-                <w:rFonts w:ascii="Times New Roman" w:hAnsi="Times New Roman"/>
-                <w:sz w:val="14"/>
-                <w:szCs w:val="14"/>
-              </w:rPr>
-            </w:pPr>
-            <w:r>
-              <w:rPr>
-                <w:rFonts w:ascii="Times New Roman" w:hAnsi="Times New Roman"/>
-                <w:sz w:val="14"/>
-                <w:szCs w:val="14"/>
-              </w:rPr>
-              <w:t xml:space="preserve">ES</w:t>
+              <w:spacing w:line="360" w:lineRule="auto" w:before="0" w:after="0"/>
+              <w:jc w:val="center"/>
+              <w:rPr>
+                <w:rFonts w:ascii="Times New Roman" w:hAnsi="Times New Roman"/>
+                <w:sz w:val="14"/>
+                <w:szCs w:val="14"/>
+              </w:rPr>
+            </w:pPr>
+            <w:r>
+              <w:rPr>
+                <w:rFonts w:ascii="Times New Roman" w:hAnsi="Times New Roman"/>
+                <w:sz w:val="14"/>
+              </w:rPr>
+              <w:t>ES</w:t>
             </w:r>
           </w:p>
         </w:tc>
@@ -346,21 +345,20 @@
           </w:tcPr>
           <w:p>
             <w:pPr>
-              <w:spacing w:line="360" w:lineRule="auto"/>
-              <w:jc w:val="center"/>
-              <w:rPr>
-                <w:rFonts w:ascii="Times New Roman" w:hAnsi="Times New Roman"/>
-                <w:sz w:val="14"/>
-                <w:szCs w:val="14"/>
-              </w:rPr>
-            </w:pPr>
-            <w:r>
-              <w:rPr>
-                <w:rFonts w:ascii="Times New Roman" w:hAnsi="Times New Roman"/>
-                <w:sz w:val="14"/>
-                <w:szCs w:val="14"/>
-              </w:rPr>
-              <w:t xml:space="preserve">America Alanis</w:t>
+              <w:spacing w:line="360" w:lineRule="auto" w:before="0" w:after="0"/>
+              <w:jc w:val="center"/>
+              <w:rPr>
+                <w:rFonts w:ascii="Times New Roman" w:hAnsi="Times New Roman"/>
+                <w:sz w:val="14"/>
+                <w:szCs w:val="14"/>
+              </w:rPr>
+            </w:pPr>
+            <w:r>
+              <w:rPr>
+                <w:rFonts w:ascii="Times New Roman" w:hAnsi="Times New Roman"/>
+                <w:sz w:val="14"/>
+              </w:rPr>
+              <w:t>America Alanis</w:t>
             </w:r>
           </w:p>
         </w:tc>
@@ -371,21 +369,16 @@
           </w:tcPr>
           <w:p>
             <w:pPr>
-              <w:spacing w:line="360" w:lineRule="auto" w:before="0" w:after="0"/>
-              <w:jc w:val="center"/>
-              <w:rPr>
-                <w:rFonts w:ascii="Times New Roman" w:hAnsi="Times New Roman"/>
-                <w:color w:val="467886"/>
-                <w:sz w:val="14"/>
-                <w:szCs w:val="14"/>
-                <w:u w:val="single"/>
-              </w:rPr>
-            </w:pPr>
-            <w:r/>
+              <w:jc w:val="center"/>
+              <w:rPr>
+                <w:rFonts w:ascii="Times New Roman" w:hAnsi="Times New Roman"/>
+                <w:sz w:val="14"/>
+                <w:szCs w:val="14"/>
+              </w:rPr>
+            </w:pPr>
             <w:hyperlink r:id="rId7" w:history="1">
               <w:r>
                 <w:rPr>
-                  <w:rStyle w:val="Hyperlink"/>
                   <w:rFonts w:ascii="Times New Roman" w:hAnsi="Times New Roman"/>
                   <w:color w:val="0000FF"/>
                   <w:sz w:val="14"/>
@@ -404,19 +397,16 @@
           </w:tcPr>
           <w:p>
             <w:pPr>
-              <w:spacing w:line="360" w:lineRule="auto" w:before="0" w:after="0"/>
-              <w:jc w:val="center"/>
-              <w:rPr>
-                <w:rFonts w:ascii="Times New Roman" w:hAnsi="Times New Roman"/>
-                <w:sz w:val="14"/>
-                <w:szCs w:val="18"/>
-              </w:rPr>
-            </w:pPr>
-            <w:r/>
+              <w:jc w:val="center"/>
+              <w:rPr>
+                <w:rFonts w:ascii="Times New Roman" w:hAnsi="Times New Roman"/>
+                <w:sz w:val="14"/>
+                <w:szCs w:val="14"/>
+              </w:rPr>
+            </w:pPr>
             <w:hyperlink r:id="rId8" w:history="1">
               <w:r>
                 <w:rPr>
-                  <w:rStyle w:val="Hyperlink"/>
                   <w:rFonts w:ascii="Times New Roman" w:hAnsi="Times New Roman"/>
                   <w:color w:val="0000FF"/>
                   <w:sz w:val="14"/>
@@ -436,7 +426,7 @@
           <w:p>
             <w:pPr>
               <w:pStyle w:val="Default"/>
-              <w:spacing w:line="360" w:lineRule="auto"/>
+              <w:spacing w:line="360" w:lineRule="auto" w:before="0" w:after="0"/>
               <w:jc w:val="center"/>
               <w:rPr>
                 <w:rFonts w:eastAsiaTheme="minorEastAsia"/>
@@ -461,22 +451,31 @@
           </w:tcPr>
           <w:p>
             <w:pPr>
-              <w:pStyle w:val="Default"/>
-              <w:spacing w:line="360" w:lineRule="auto"/>
-              <w:jc w:val="center"/>
-              <w:rPr>
-                <w:rFonts w:eastAsiaTheme="minorEastAsia"/>
-                <w:sz w:val="14"/>
-                <w:szCs w:val="14"/>
-                <w:lang w:eastAsia="zh-CN"/>
-              </w:rPr>
-            </w:pPr>
-            <w:r>
-              <w:rPr>
-                <w:sz w:val="14"/>
-                <w:szCs w:val="14"/>
-              </w:rPr>
-              <w:t xml:space="preserve">Pending (Gram stain ongoing)</w:t>
+              <w:jc w:val="center"/>
+              <w:rPr>
+                <w:rFonts w:ascii="Times New Roman" w:hAnsi="Times New Roman"/>
+                <w:sz w:val="14"/>
+                <w:szCs w:val="14"/>
+              </w:rPr>
+            </w:pPr>
+            <w:r>
+              <w:rPr>
+                <w:rFonts w:ascii="Times New Roman" w:hAnsi="Times New Roman"/>
+                <w:i/>
+                <w:iCs/>
+                <w:sz w:val="14"/>
+                <w:szCs w:val="14"/>
+              </w:rPr>
+              <w:t>Terribacillus goriensis</w:t>
+              <w:br/>
+            </w:r>
+            <w:r>
+              <w:rPr>
+                <w:rFonts w:ascii="Times New Roman" w:hAnsi="Times New Roman"/>
+                <w:sz w:val="14"/>
+                <w:szCs w:val="14"/>
+              </w:rPr>
+              <w:t>(Gram (+) rods)</w:t>
             </w:r>
           </w:p>
         </w:tc>
@@ -4733,6 +4732,7 @@
           </w:tcPr>
           <w:p>
             <w:pPr>
+              <w:spacing w:before="0" w:after="0"/>
               <w:jc w:val="center"/>
               <w:rPr>
                 <w:rFonts w:ascii="Times New Roman" w:hAnsi="Times New Roman"/>
@@ -4763,6 +4763,7 @@
           </w:tcPr>
           <w:p>
             <w:pPr>
+              <w:spacing w:before="0" w:after="0"/>
               <w:jc w:val="center"/>
             </w:pPr>
             <w:r>
@@ -4814,6 +4815,7 @@
           </w:tcPr>
           <w:p>
             <w:pPr>
+              <w:spacing w:before="0" w:after="0"/>
               <w:jc w:val="center"/>
               <w:rPr>
                 <w:rFonts w:ascii="Times New Roman" w:hAnsi="Times New Roman"/>
@@ -4843,6 +4845,7 @@
           </w:tcPr>
           <w:p>
             <w:pPr>
+              <w:spacing w:before="0" w:after="0"/>
               <w:jc w:val="center"/>
               <w:rPr>
                 <w:rFonts w:ascii="Times New Roman" w:hAnsi="Times New Roman"/>
@@ -4873,6 +4876,7 @@
           </w:tcPr>
           <w:p>
             <w:pPr>
+              <w:spacing w:before="0" w:after="0"/>
               <w:jc w:val="center"/>
               <w:rPr>
                 <w:rFonts w:ascii="Times New Roman" w:hAnsi="Times New Roman"/>
@@ -5022,6 +5026,7 @@
           </w:tcPr>
           <w:p>
             <w:pPr>
+              <w:spacing w:before="0" w:after="0"/>
               <w:jc w:val="center"/>
               <w:rPr>
                 <w:rFonts w:ascii="Times New Roman" w:hAnsi="Times New Roman"/>
@@ -5052,6 +5057,7 @@
           </w:tcPr>
           <w:p>
             <w:pPr>
+              <w:spacing w:before="0" w:after="0"/>
               <w:jc w:val="center"/>
             </w:pPr>
             <w:r>
@@ -5103,6 +5109,7 @@
           </w:tcPr>
           <w:p>
             <w:pPr>
+              <w:spacing w:before="0" w:after="0"/>
               <w:jc w:val="center"/>
               <w:rPr>
                 <w:rFonts w:ascii="Times New Roman" w:hAnsi="Times New Roman"/>
@@ -5132,6 +5139,7 @@
           </w:tcPr>
           <w:p>
             <w:pPr>
+              <w:spacing w:before="0" w:after="0"/>
               <w:jc w:val="center"/>
               <w:rPr>
                 <w:rFonts w:ascii="Times New Roman" w:hAnsi="Times New Roman"/>
@@ -5162,6 +5170,7 @@
           </w:tcPr>
           <w:p>
             <w:pPr>
+              <w:spacing w:before="0" w:after="0"/>
               <w:jc w:val="center"/>
               <w:rPr>
                 <w:rFonts w:ascii="Times New Roman" w:hAnsi="Times New Roman"/>
@@ -9500,6 +9509,7 @@
           </w:tcPr>
           <w:p>
             <w:pPr>
+              <w:spacing w:before="0" w:after="0"/>
               <w:jc w:val="center"/>
               <w:rPr>
                 <w:rFonts w:ascii="Times New Roman" w:hAnsi="Times New Roman"/>
@@ -9530,6 +9540,7 @@
           </w:tcPr>
           <w:p>
             <w:pPr>
+              <w:spacing w:before="0" w:after="0"/>
               <w:jc w:val="center"/>
             </w:pPr>
             <w:r>
@@ -9581,6 +9592,7 @@
           </w:tcPr>
           <w:p>
             <w:pPr>
+              <w:spacing w:before="0" w:after="0"/>
               <w:jc w:val="center"/>
               <w:rPr>
                 <w:rFonts w:ascii="Times New Roman" w:hAnsi="Times New Roman"/>
@@ -9610,6 +9622,7 @@
           </w:tcPr>
           <w:p>
             <w:pPr>
+              <w:spacing w:before="0" w:after="0"/>
               <w:jc w:val="center"/>
               <w:rPr>
                 <w:rFonts w:ascii="Times New Roman" w:hAnsi="Times New Roman"/>
@@ -9640,6 +9653,7 @@
           </w:tcPr>
           <w:p>
             <w:pPr>
+              <w:spacing w:before="0" w:after="0"/>
               <w:jc w:val="center"/>
               <w:rPr>
                 <w:rFonts w:ascii="Times New Roman" w:hAnsi="Times New Roman"/>
@@ -9789,6 +9803,7 @@
           </w:tcPr>
           <w:p>
             <w:pPr>
+              <w:spacing w:before="0" w:after="0"/>
               <w:jc w:val="center"/>
               <w:rPr>
                 <w:rFonts w:ascii="Times New Roman" w:hAnsi="Times New Roman"/>
@@ -9819,6 +9834,7 @@
           </w:tcPr>
           <w:p>
             <w:pPr>
+              <w:spacing w:before="0" w:after="0"/>
               <w:jc w:val="center"/>
             </w:pPr>
             <w:r>
@@ -9870,6 +9886,7 @@
           </w:tcPr>
           <w:p>
             <w:pPr>
+              <w:spacing w:before="0" w:after="0"/>
               <w:jc w:val="center"/>
               <w:rPr>
                 <w:rFonts w:ascii="Times New Roman" w:hAnsi="Times New Roman"/>
@@ -9899,6 +9916,7 @@
           </w:tcPr>
           <w:p>
             <w:pPr>
+              <w:spacing w:before="0" w:after="0"/>
               <w:jc w:val="center"/>
               <w:rPr>
                 <w:rFonts w:ascii="Times New Roman" w:hAnsi="Times New Roman"/>
@@ -9929,6 +9947,7 @@
           </w:tcPr>
           <w:p>
             <w:pPr>
+              <w:spacing w:before="0" w:after="0"/>
               <w:jc w:val="center"/>
               <w:rPr>
                 <w:rFonts w:ascii="Times New Roman" w:hAnsi="Times New Roman"/>

</xml_diff>

<commit_message>
docs(review): integrate Robin Sharma QA review feedback (OOS-262080) into AGENTS.md, PRD.md, and table templates
</commit_message>
<xml_diff>
--- a/scratch/Celsis table OOS-262017.docx
+++ b/scratch/Celsis table OOS-262017.docx
@@ -4798,7 +4798,7 @@
                 <w:sz w:val="14"/>
                 <w:szCs w:val="14"/>
               </w:rPr>
-              <w:t xml:space="preserve">Week on Testing Date</w:t>
+              <w:t xml:space="preserve">Week of Testing</w:t>
             </w:r>
           </w:p>
         </w:tc>
@@ -5092,7 +5092,7 @@
                 <w:sz w:val="14"/>
                 <w:szCs w:val="14"/>
               </w:rPr>
-              <w:t xml:space="preserve">Week on Testing Date</w:t>
+              <w:t xml:space="preserve">Week of Testing</w:t>
             </w:r>
           </w:p>
         </w:tc>
@@ -9575,7 +9575,7 @@
                 <w:sz w:val="14"/>
                 <w:szCs w:val="14"/>
               </w:rPr>
-              <w:t xml:space="preserve">Week on Testing Date</w:t>
+              <w:t xml:space="preserve">Week of Testing</w:t>
             </w:r>
           </w:p>
         </w:tc>
@@ -9869,7 +9869,7 @@
                 <w:sz w:val="14"/>
                 <w:szCs w:val="14"/>
               </w:rPr>
-              <w:t xml:space="preserve">Week on Testing Date</w:t>
+              <w:t xml:space="preserve">Week of Testing</w:t>
             </w:r>
           </w:p>
         </w:tc>

</xml_diff>

<commit_message>
fix(celsis): update 25Aug26 BSC surface and settling analyst to GS per dual-track EM tracing
</commit_message>
<xml_diff>
--- a/scratch/Celsis table OOS-262017.docx
+++ b/scratch/Celsis table OOS-262017.docx
@@ -2739,7 +2739,7 @@
                 <w:sz w:val="14"/>
                 <w:szCs w:val="14"/>
               </w:rPr>
-              <w:t>ES</w:t>
+              <w:t>GS</w:t>
             </w:r>
           </w:p>
         </w:tc>
@@ -3708,7 +3708,7 @@
                 <w:sz w:val="14"/>
                 <w:szCs w:val="14"/>
               </w:rPr>
-              <w:t>ES</w:t>
+              <w:t>GS</w:t>
             </w:r>
           </w:p>
         </w:tc>

</xml_diff>

<commit_message>
feat(celsis): populate 0112 gram stain (3 Gram (+) cocci, 1 Hyphae) in Table 2
</commit_message>
<xml_diff>
--- a/scratch/Celsis table OOS-262017.docx
+++ b/scratch/Celsis table OOS-262017.docx
@@ -4155,20 +4155,31 @@
           <w:p>
             <w:pPr>
               <w:jc w:val="center"/>
-              <w:spacing w:before="0" w:after="0" w:line="240" w:lineRule="auto"/>
-              <w:rPr>
-                <w:rFonts w:ascii="Times New Roman" w:hAnsi="Times New Roman"/>
-                <w:sz w:val="14"/>
-                <w:szCs w:val="14"/>
-              </w:rPr>
-            </w:pPr>
-            <w:r>
-              <w:rPr>
-                <w:rFonts w:ascii="Times New Roman" w:hAnsi="Times New Roman"/>
-                <w:sz w:val="14"/>
-                <w:szCs w:val="14"/>
-              </w:rPr>
-              <w:t>Pending ID</w:t>
+              <w:spacing w:before="0" w:after="0" w:line="220" w:lineRule="auto"/>
+              <w:rPr>
+                <w:rFonts w:ascii="Times New Roman" w:hAnsi="Times New Roman"/>
+                <w:sz w:val="13"/>
+                <w:szCs w:val="13"/>
+              </w:rPr>
+            </w:pPr>
+            <w:r>
+              <w:rPr>
+                <w:rFonts w:ascii="Times New Roman" w:hAnsi="Times New Roman"/>
+                <w:sz w:val="13"/>
+                <w:szCs w:val="13"/>
+              </w:rPr>
+              <w:t>3 Gram (+) cocci</w:t>
+            </w:r>
+            <w:r>
+              <w:br/>
+            </w:r>
+            <w:r>
+              <w:rPr>
+                <w:rFonts w:ascii="Times New Roman" w:hAnsi="Times New Roman"/>
+                <w:sz w:val="13"/>
+                <w:szCs w:val="13"/>
+              </w:rPr>
+              <w:t>1 Hyphae</w:t>
             </w:r>
           </w:p>
         </w:tc>

</xml_diff>

<commit_message>
feat(celsis): inject live EagleTrax hyperlink for ETX-260901-0112 in Table 2
</commit_message>
<xml_diff>
--- a/scratch/Celsis table OOS-262017.docx
+++ b/scratch/Celsis table OOS-262017.docx
@@ -4130,14 +4130,18 @@
                 <w:szCs w:val="14"/>
               </w:rPr>
             </w:pPr>
-            <w:r>
-              <w:rPr>
-                <w:rFonts w:ascii="Times New Roman" w:hAnsi="Times New Roman"/>
-                <w:sz w:val="14"/>
-                <w:szCs w:val="14"/>
-              </w:rPr>
-              <w:t>ETX-260901-0112</w:t>
-            </w:r>
+            <w:hyperlink r:id="rId9" w:history="1">
+              <w:r>
+                <w:rPr>
+                  <w:rFonts w:ascii="Times New Roman" w:hAnsi="Times New Roman"/>
+                  <w:color w:val="0000FF"/>
+                  <w:sz w:val="14"/>
+                  <w:szCs w:val="14"/>
+                  <w:u w:val="single"/>
+                </w:rPr>
+                <w:t>ETX-260901-0112</w:t>
+              </w:r>
+            </w:hyperlink>
           </w:p>
         </w:tc>
         <w:tc>
@@ -8137,7 +8141,7 @@
                 <w:szCs w:val="14"/>
               </w:rPr>
             </w:pPr>
-            <w:hyperlink r:id="rId9" w:history="1">
+            <w:hyperlink r:id="rId10" w:history="1">
               <w:r>
                 <w:rPr>
                   <w:rFonts w:ascii="Times New Roman" w:hAnsi="Times New Roman"/>

</xml_diff>

<commit_message>
feat(celsis): complete OOS-262017 report generation using 31AUG26 packet and 1.pdf data
</commit_message>
<xml_diff>
--- a/scratch/Celsis table OOS-262017.docx
+++ b/scratch/Celsis table OOS-262017.docx
@@ -323,7 +323,6 @@
           <w:p>
             <w:pPr>
               <w:jc w:val="center"/>
-              <w:spacing w:before="0" w:after="0" w:line="240" w:lineRule="auto"/>
               <w:rPr>
                 <w:rFonts w:ascii="Times New Roman" w:hAnsi="Times New Roman"/>
                 <w:sz w:val="14"/>
@@ -348,7 +347,6 @@
           <w:p>
             <w:pPr>
               <w:jc w:val="center"/>
-              <w:spacing w:before="0" w:after="0" w:line="240" w:lineRule="auto"/>
               <w:rPr>
                 <w:rFonts w:ascii="Times New Roman" w:hAnsi="Times New Roman"/>
                 <w:sz w:val="14"/>
@@ -373,7 +371,6 @@
           <w:p>
             <w:pPr>
               <w:jc w:val="center"/>
-              <w:spacing w:before="0" w:after="0" w:line="240" w:lineRule="auto"/>
               <w:rPr>
                 <w:rFonts w:ascii="Times New Roman" w:hAnsi="Times New Roman"/>
                 <w:sz w:val="14"/>
@@ -402,7 +399,6 @@
           <w:p>
             <w:pPr>
               <w:jc w:val="center"/>
-              <w:spacing w:before="0" w:after="0" w:line="240" w:lineRule="auto"/>
               <w:rPr>
                 <w:rFonts w:ascii="Times New Roman" w:hAnsi="Times New Roman"/>
                 <w:sz w:val="14"/>
@@ -431,7 +427,6 @@
           <w:p>
             <w:pPr>
               <w:jc w:val="center"/>
-              <w:spacing w:before="0" w:after="0" w:line="240" w:lineRule="auto"/>
               <w:rPr>
                 <w:rFonts w:ascii="Times New Roman" w:hAnsi="Times New Roman"/>
                 <w:sz w:val="14"/>
@@ -456,13 +451,14 @@
           <w:p>
             <w:pPr>
               <w:jc w:val="center"/>
-              <w:spacing w:before="0" w:after="0" w:line="240" w:lineRule="auto"/>
-              <w:rPr>
-                <w:rFonts w:ascii="Times New Roman" w:hAnsi="Times New Roman"/>
-                <w:sz w:val="14"/>
-                <w:szCs w:val="14"/>
-              </w:rPr>
-            </w:pPr>
+              <w:rPr>
+                <w:rFonts w:ascii="Times New Roman" w:eastAsiaTheme="minorEastAsia" w:hAnsi="Times New Roman" w:hint="eastAsia"/>
+                <w:sz w:val="14"/>
+                <w:szCs w:val="14"/>
+                <w:lang w:eastAsia="zh-CN"/>
+              </w:rPr>
+            </w:pPr>
+            <w:proofErr w:type="spellStart"/>
             <w:r>
               <w:rPr>
                 <w:rFonts w:ascii="Times New Roman" w:hAnsi="Times New Roman"/>
@@ -471,17 +467,31 @@
                 <w:sz w:val="14"/>
                 <w:szCs w:val="14"/>
               </w:rPr>
-              <w:t>Terribacillus goriensis</w:t>
-              <w:br/>
-            </w:r>
-            <w:r>
-              <w:rPr>
-                <w:rFonts w:ascii="Times New Roman" w:hAnsi="Times New Roman"/>
-                <w:sz w:val="14"/>
-                <w:szCs w:val="14"/>
-              </w:rPr>
-              <w:t>(Gram (+) rods)</w:t>
-            </w:r>
+              <w:t>Terribacillus</w:t>
+            </w:r>
+            <w:proofErr w:type="spellEnd"/>
+            <w:r>
+              <w:rPr>
+                <w:rFonts w:ascii="Times New Roman" w:hAnsi="Times New Roman"/>
+                <w:i/>
+                <w:iCs/>
+                <w:sz w:val="14"/>
+                <w:szCs w:val="14"/>
+              </w:rPr>
+              <w:t xml:space="preserve"> </w:t>
+            </w:r>
+            <w:proofErr w:type="spellStart"/>
+            <w:r>
+              <w:rPr>
+                <w:rFonts w:ascii="Times New Roman" w:hAnsi="Times New Roman"/>
+                <w:i/>
+                <w:iCs/>
+                <w:sz w:val="14"/>
+                <w:szCs w:val="14"/>
+              </w:rPr>
+              <w:t>goriensis</w:t>
+            </w:r>
+            <w:proofErr w:type="spellEnd"/>
           </w:p>
         </w:tc>
       </w:tr>
@@ -1024,7 +1034,6 @@
           <w:p>
             <w:pPr>
               <w:jc w:val="center"/>
-              <w:spacing w:before="0" w:after="0" w:line="240" w:lineRule="auto"/>
               <w:rPr>
                 <w:rFonts w:ascii="Times New Roman" w:hAnsi="Times New Roman"/>
                 <w:sz w:val="14"/>
@@ -1061,7 +1070,6 @@
           <w:p>
             <w:pPr>
               <w:jc w:val="center"/>
-              <w:spacing w:before="0" w:after="0" w:line="240" w:lineRule="auto"/>
               <w:rPr>
                 <w:rFonts w:ascii="Times New Roman" w:hAnsi="Times New Roman"/>
                 <w:sz w:val="14"/>
@@ -1097,7 +1105,6 @@
           <w:p>
             <w:pPr>
               <w:jc w:val="center"/>
-              <w:spacing w:before="0" w:after="0" w:line="240" w:lineRule="auto"/>
               <w:rPr>
                 <w:rFonts w:ascii="Times New Roman" w:hAnsi="Times New Roman"/>
                 <w:sz w:val="14"/>
@@ -1134,7 +1141,6 @@
           <w:p>
             <w:pPr>
               <w:jc w:val="center"/>
-              <w:spacing w:before="0" w:after="0" w:line="240" w:lineRule="auto"/>
               <w:rPr>
                 <w:rFonts w:ascii="Times New Roman" w:hAnsi="Times New Roman"/>
                 <w:sz w:val="14"/>
@@ -1170,7 +1176,6 @@
           <w:p>
             <w:pPr>
               <w:jc w:val="center"/>
-              <w:spacing w:before="0" w:after="0" w:line="240" w:lineRule="auto"/>
               <w:rPr>
                 <w:rFonts w:ascii="Times New Roman" w:hAnsi="Times New Roman"/>
                 <w:sz w:val="14"/>
@@ -1206,7 +1211,6 @@
           <w:p>
             <w:pPr>
               <w:jc w:val="center"/>
-              <w:spacing w:before="0" w:after="0" w:line="240" w:lineRule="auto"/>
               <w:rPr>
                 <w:rFonts w:ascii="Times New Roman" w:hAnsi="Times New Roman"/>
                 <w:sz w:val="14"/>
@@ -1243,7 +1247,6 @@
           <w:p>
             <w:pPr>
               <w:jc w:val="center"/>
-              <w:spacing w:before="0" w:after="0" w:line="240" w:lineRule="auto"/>
               <w:rPr>
                 <w:rFonts w:ascii="Times New Roman" w:hAnsi="Times New Roman"/>
                 <w:sz w:val="14"/>
@@ -1347,7 +1350,6 @@
           <w:p>
             <w:pPr>
               <w:jc w:val="center"/>
-              <w:spacing w:before="0" w:after="0" w:line="240" w:lineRule="auto"/>
               <w:rPr>
                 <w:rFonts w:ascii="Times New Roman" w:hAnsi="Times New Roman"/>
                 <w:sz w:val="14"/>
@@ -1384,7 +1386,6 @@
           <w:p>
             <w:pPr>
               <w:jc w:val="center"/>
-              <w:spacing w:before="0" w:after="0" w:line="240" w:lineRule="auto"/>
               <w:rPr>
                 <w:rFonts w:ascii="Times New Roman" w:hAnsi="Times New Roman"/>
                 <w:sz w:val="14"/>
@@ -1420,7 +1421,6 @@
           <w:p>
             <w:pPr>
               <w:jc w:val="center"/>
-              <w:spacing w:before="0" w:after="0" w:line="240" w:lineRule="auto"/>
               <w:rPr>
                 <w:rFonts w:ascii="Times New Roman" w:hAnsi="Times New Roman"/>
                 <w:sz w:val="14"/>
@@ -1457,7 +1457,6 @@
           <w:p>
             <w:pPr>
               <w:jc w:val="center"/>
-              <w:spacing w:before="0" w:after="0" w:line="240" w:lineRule="auto"/>
               <w:rPr>
                 <w:rFonts w:ascii="Times New Roman" w:hAnsi="Times New Roman"/>
                 <w:sz w:val="14"/>
@@ -1493,7 +1492,6 @@
           <w:p>
             <w:pPr>
               <w:jc w:val="center"/>
-              <w:spacing w:before="0" w:after="0" w:line="240" w:lineRule="auto"/>
               <w:rPr>
                 <w:rFonts w:ascii="Times New Roman" w:hAnsi="Times New Roman"/>
                 <w:sz w:val="14"/>
@@ -1529,7 +1527,6 @@
           <w:p>
             <w:pPr>
               <w:jc w:val="center"/>
-              <w:spacing w:before="0" w:after="0" w:line="240" w:lineRule="auto"/>
               <w:rPr>
                 <w:rFonts w:ascii="Times New Roman" w:hAnsi="Times New Roman"/>
                 <w:sz w:val="14"/>
@@ -1566,7 +1563,6 @@
           <w:p>
             <w:pPr>
               <w:jc w:val="center"/>
-              <w:spacing w:before="0" w:after="0" w:line="240" w:lineRule="auto"/>
               <w:rPr>
                 <w:rFonts w:ascii="Times New Roman" w:hAnsi="Times New Roman"/>
                 <w:sz w:val="14"/>
@@ -1670,7 +1666,6 @@
           <w:p>
             <w:pPr>
               <w:jc w:val="center"/>
-              <w:spacing w:before="0" w:after="0" w:line="240" w:lineRule="auto"/>
               <w:rPr>
                 <w:rFonts w:ascii="Times New Roman" w:hAnsi="Times New Roman"/>
                 <w:sz w:val="14"/>
@@ -1707,7 +1702,6 @@
           <w:p>
             <w:pPr>
               <w:jc w:val="center"/>
-              <w:spacing w:before="0" w:after="0" w:line="240" w:lineRule="auto"/>
               <w:rPr>
                 <w:rFonts w:ascii="Times New Roman" w:hAnsi="Times New Roman"/>
                 <w:sz w:val="14"/>
@@ -1743,7 +1737,6 @@
           <w:p>
             <w:pPr>
               <w:jc w:val="center"/>
-              <w:spacing w:before="0" w:after="0" w:line="240" w:lineRule="auto"/>
               <w:rPr>
                 <w:rFonts w:ascii="Times New Roman" w:hAnsi="Times New Roman"/>
                 <w:sz w:val="14"/>
@@ -1780,7 +1773,6 @@
           <w:p>
             <w:pPr>
               <w:jc w:val="center"/>
-              <w:spacing w:before="0" w:after="0" w:line="240" w:lineRule="auto"/>
               <w:rPr>
                 <w:rFonts w:ascii="Times New Roman" w:hAnsi="Times New Roman"/>
                 <w:sz w:val="14"/>
@@ -1816,7 +1808,6 @@
           <w:p>
             <w:pPr>
               <w:jc w:val="center"/>
-              <w:spacing w:before="0" w:after="0" w:line="240" w:lineRule="auto"/>
               <w:rPr>
                 <w:rFonts w:ascii="Times New Roman" w:hAnsi="Times New Roman"/>
                 <w:sz w:val="14"/>
@@ -1852,7 +1843,6 @@
           <w:p>
             <w:pPr>
               <w:jc w:val="center"/>
-              <w:spacing w:before="0" w:after="0" w:line="240" w:lineRule="auto"/>
               <w:rPr>
                 <w:rFonts w:ascii="Times New Roman" w:hAnsi="Times New Roman"/>
                 <w:sz w:val="14"/>
@@ -1889,7 +1879,6 @@
           <w:p>
             <w:pPr>
               <w:jc w:val="center"/>
-              <w:spacing w:before="0" w:after="0" w:line="240" w:lineRule="auto"/>
               <w:rPr>
                 <w:rFonts w:ascii="Times New Roman" w:hAnsi="Times New Roman"/>
                 <w:sz w:val="14"/>
@@ -2029,7 +2018,6 @@
           <w:p>
             <w:pPr>
               <w:jc w:val="center"/>
-              <w:spacing w:before="0" w:after="0" w:line="240" w:lineRule="auto"/>
               <w:rPr>
                 <w:rFonts w:ascii="Times New Roman" w:hAnsi="Times New Roman"/>
                 <w:sz w:val="14"/>
@@ -2066,7 +2054,6 @@
           <w:p>
             <w:pPr>
               <w:jc w:val="center"/>
-              <w:spacing w:before="0" w:after="0" w:line="240" w:lineRule="auto"/>
               <w:rPr>
                 <w:rFonts w:ascii="Times New Roman" w:hAnsi="Times New Roman"/>
                 <w:sz w:val="14"/>
@@ -2102,7 +2089,6 @@
           <w:p>
             <w:pPr>
               <w:jc w:val="center"/>
-              <w:spacing w:before="0" w:after="0" w:line="240" w:lineRule="auto"/>
               <w:rPr>
                 <w:rFonts w:ascii="Times New Roman" w:hAnsi="Times New Roman"/>
                 <w:sz w:val="14"/>
@@ -2139,7 +2125,6 @@
           <w:p>
             <w:pPr>
               <w:jc w:val="center"/>
-              <w:spacing w:before="0" w:after="0" w:line="240" w:lineRule="auto"/>
               <w:rPr>
                 <w:rFonts w:ascii="Times New Roman" w:hAnsi="Times New Roman"/>
                 <w:sz w:val="14"/>
@@ -2175,7 +2160,6 @@
           <w:p>
             <w:pPr>
               <w:jc w:val="center"/>
-              <w:spacing w:before="0" w:after="0" w:line="240" w:lineRule="auto"/>
               <w:rPr>
                 <w:rFonts w:ascii="Times New Roman" w:hAnsi="Times New Roman"/>
                 <w:sz w:val="14"/>
@@ -2211,7 +2195,6 @@
           <w:p>
             <w:pPr>
               <w:jc w:val="center"/>
-              <w:spacing w:before="0" w:after="0" w:line="240" w:lineRule="auto"/>
               <w:rPr>
                 <w:rFonts w:ascii="Times New Roman" w:hAnsi="Times New Roman"/>
                 <w:sz w:val="14"/>
@@ -2248,7 +2231,6 @@
           <w:p>
             <w:pPr>
               <w:jc w:val="center"/>
-              <w:spacing w:before="0" w:after="0" w:line="240" w:lineRule="auto"/>
               <w:rPr>
                 <w:rFonts w:ascii="Times New Roman" w:hAnsi="Times New Roman"/>
                 <w:sz w:val="14"/>
@@ -2366,7 +2348,6 @@
           <w:p>
             <w:pPr>
               <w:jc w:val="center"/>
-              <w:spacing w:before="0" w:after="0" w:line="240" w:lineRule="auto"/>
               <w:rPr>
                 <w:rFonts w:ascii="Times New Roman" w:hAnsi="Times New Roman"/>
                 <w:sz w:val="14"/>
@@ -2403,7 +2384,6 @@
           <w:p>
             <w:pPr>
               <w:jc w:val="center"/>
-              <w:spacing w:before="0" w:after="0" w:line="240" w:lineRule="auto"/>
               <w:rPr>
                 <w:rFonts w:ascii="Times New Roman" w:hAnsi="Times New Roman"/>
                 <w:sz w:val="14"/>
@@ -2439,7 +2419,6 @@
           <w:p>
             <w:pPr>
               <w:jc w:val="center"/>
-              <w:spacing w:before="0" w:after="0" w:line="240" w:lineRule="auto"/>
               <w:rPr>
                 <w:rFonts w:ascii="Times New Roman" w:hAnsi="Times New Roman"/>
                 <w:sz w:val="14"/>
@@ -2476,7 +2455,6 @@
           <w:p>
             <w:pPr>
               <w:jc w:val="center"/>
-              <w:spacing w:before="0" w:after="0" w:line="240" w:lineRule="auto"/>
               <w:rPr>
                 <w:rFonts w:ascii="Times New Roman" w:hAnsi="Times New Roman"/>
                 <w:sz w:val="14"/>
@@ -2512,7 +2490,6 @@
           <w:p>
             <w:pPr>
               <w:jc w:val="center"/>
-              <w:spacing w:before="0" w:after="0" w:line="240" w:lineRule="auto"/>
               <w:rPr>
                 <w:rFonts w:ascii="Times New Roman" w:hAnsi="Times New Roman"/>
                 <w:sz w:val="14"/>
@@ -2548,7 +2525,6 @@
           <w:p>
             <w:pPr>
               <w:jc w:val="center"/>
-              <w:spacing w:before="0" w:after="0" w:line="240" w:lineRule="auto"/>
               <w:rPr>
                 <w:rFonts w:ascii="Times New Roman" w:hAnsi="Times New Roman"/>
                 <w:sz w:val="14"/>
@@ -2585,7 +2561,6 @@
           <w:p>
             <w:pPr>
               <w:jc w:val="center"/>
-              <w:spacing w:before="0" w:after="0" w:line="240" w:lineRule="auto"/>
               <w:rPr>
                 <w:rFonts w:ascii="Times New Roman" w:hAnsi="Times New Roman"/>
                 <w:sz w:val="14"/>
@@ -2689,7 +2664,6 @@
           <w:p>
             <w:pPr>
               <w:jc w:val="center"/>
-              <w:spacing w:before="0" w:after="0" w:line="240" w:lineRule="auto"/>
               <w:rPr>
                 <w:rFonts w:ascii="Times New Roman" w:hAnsi="Times New Roman"/>
                 <w:sz w:val="14"/>
@@ -2726,7 +2700,6 @@
           <w:p>
             <w:pPr>
               <w:jc w:val="center"/>
-              <w:spacing w:before="0" w:after="0" w:line="240" w:lineRule="auto"/>
               <w:rPr>
                 <w:rFonts w:ascii="Times New Roman" w:hAnsi="Times New Roman"/>
                 <w:sz w:val="14"/>
@@ -2762,7 +2735,6 @@
           <w:p>
             <w:pPr>
               <w:jc w:val="center"/>
-              <w:spacing w:before="0" w:after="0" w:line="240" w:lineRule="auto"/>
               <w:rPr>
                 <w:rFonts w:ascii="Times New Roman" w:hAnsi="Times New Roman"/>
                 <w:sz w:val="14"/>
@@ -2799,7 +2771,6 @@
           <w:p>
             <w:pPr>
               <w:jc w:val="center"/>
-              <w:spacing w:before="0" w:after="0" w:line="240" w:lineRule="auto"/>
               <w:rPr>
                 <w:rFonts w:ascii="Times New Roman" w:hAnsi="Times New Roman"/>
                 <w:sz w:val="14"/>
@@ -2835,7 +2806,6 @@
           <w:p>
             <w:pPr>
               <w:jc w:val="center"/>
-              <w:spacing w:before="0" w:after="0" w:line="240" w:lineRule="auto"/>
               <w:rPr>
                 <w:rFonts w:ascii="Times New Roman" w:hAnsi="Times New Roman"/>
                 <w:sz w:val="14"/>
@@ -2871,7 +2841,6 @@
           <w:p>
             <w:pPr>
               <w:jc w:val="center"/>
-              <w:spacing w:before="0" w:after="0" w:line="240" w:lineRule="auto"/>
               <w:rPr>
                 <w:rFonts w:ascii="Times New Roman" w:hAnsi="Times New Roman"/>
                 <w:sz w:val="14"/>
@@ -2908,7 +2877,6 @@
           <w:p>
             <w:pPr>
               <w:jc w:val="center"/>
-              <w:spacing w:before="0" w:after="0" w:line="240" w:lineRule="auto"/>
               <w:rPr>
                 <w:rFonts w:ascii="Times New Roman" w:hAnsi="Times New Roman"/>
                 <w:sz w:val="14"/>
@@ -3012,7 +2980,6 @@
           <w:p>
             <w:pPr>
               <w:jc w:val="center"/>
-              <w:spacing w:before="0" w:after="0" w:line="240" w:lineRule="auto"/>
               <w:rPr>
                 <w:rFonts w:ascii="Times New Roman" w:hAnsi="Times New Roman"/>
                 <w:sz w:val="14"/>
@@ -3049,7 +3016,6 @@
           <w:p>
             <w:pPr>
               <w:jc w:val="center"/>
-              <w:spacing w:before="0" w:after="0" w:line="240" w:lineRule="auto"/>
               <w:rPr>
                 <w:rFonts w:ascii="Times New Roman" w:hAnsi="Times New Roman"/>
                 <w:sz w:val="14"/>
@@ -3085,7 +3051,6 @@
           <w:p>
             <w:pPr>
               <w:jc w:val="center"/>
-              <w:spacing w:before="0" w:after="0" w:line="240" w:lineRule="auto"/>
               <w:rPr>
                 <w:rFonts w:ascii="Times New Roman" w:hAnsi="Times New Roman"/>
                 <w:sz w:val="14"/>
@@ -3122,7 +3087,6 @@
           <w:p>
             <w:pPr>
               <w:jc w:val="center"/>
-              <w:spacing w:before="0" w:after="0" w:line="240" w:lineRule="auto"/>
               <w:rPr>
                 <w:rFonts w:ascii="Times New Roman" w:hAnsi="Times New Roman"/>
                 <w:sz w:val="14"/>
@@ -3158,7 +3122,6 @@
           <w:p>
             <w:pPr>
               <w:jc w:val="center"/>
-              <w:spacing w:before="0" w:after="0" w:line="240" w:lineRule="auto"/>
               <w:rPr>
                 <w:rFonts w:ascii="Times New Roman" w:hAnsi="Times New Roman"/>
                 <w:sz w:val="14"/>
@@ -3194,7 +3157,6 @@
           <w:p>
             <w:pPr>
               <w:jc w:val="center"/>
-              <w:spacing w:before="0" w:after="0" w:line="240" w:lineRule="auto"/>
               <w:rPr>
                 <w:rFonts w:ascii="Times New Roman" w:hAnsi="Times New Roman"/>
                 <w:sz w:val="14"/>
@@ -3231,7 +3193,6 @@
           <w:p>
             <w:pPr>
               <w:jc w:val="center"/>
-              <w:spacing w:before="0" w:after="0" w:line="240" w:lineRule="auto"/>
               <w:rPr>
                 <w:rFonts w:ascii="Times New Roman" w:hAnsi="Times New Roman"/>
                 <w:sz w:val="14"/>
@@ -3335,7 +3296,6 @@
           <w:p>
             <w:pPr>
               <w:jc w:val="center"/>
-              <w:spacing w:before="0" w:after="0" w:line="240" w:lineRule="auto"/>
               <w:rPr>
                 <w:rFonts w:ascii="Times New Roman" w:hAnsi="Times New Roman"/>
                 <w:sz w:val="14"/>
@@ -3372,7 +3332,6 @@
           <w:p>
             <w:pPr>
               <w:jc w:val="center"/>
-              <w:spacing w:before="0" w:after="0" w:line="240" w:lineRule="auto"/>
               <w:rPr>
                 <w:rFonts w:ascii="Times New Roman" w:hAnsi="Times New Roman"/>
                 <w:sz w:val="14"/>
@@ -3408,7 +3367,6 @@
           <w:p>
             <w:pPr>
               <w:jc w:val="center"/>
-              <w:spacing w:before="0" w:after="0" w:line="240" w:lineRule="auto"/>
               <w:rPr>
                 <w:rFonts w:ascii="Times New Roman" w:hAnsi="Times New Roman"/>
                 <w:sz w:val="14"/>
@@ -3445,7 +3403,6 @@
           <w:p>
             <w:pPr>
               <w:jc w:val="center"/>
-              <w:spacing w:before="0" w:after="0" w:line="240" w:lineRule="auto"/>
               <w:rPr>
                 <w:rFonts w:ascii="Times New Roman" w:hAnsi="Times New Roman"/>
                 <w:sz w:val="14"/>
@@ -3481,7 +3438,6 @@
           <w:p>
             <w:pPr>
               <w:jc w:val="center"/>
-              <w:spacing w:before="0" w:after="0" w:line="240" w:lineRule="auto"/>
               <w:rPr>
                 <w:rFonts w:ascii="Times New Roman" w:hAnsi="Times New Roman"/>
                 <w:sz w:val="14"/>
@@ -3517,7 +3473,6 @@
           <w:p>
             <w:pPr>
               <w:jc w:val="center"/>
-              <w:spacing w:before="0" w:after="0" w:line="240" w:lineRule="auto"/>
               <w:rPr>
                 <w:rFonts w:ascii="Times New Roman" w:hAnsi="Times New Roman"/>
                 <w:sz w:val="14"/>
@@ -3554,7 +3509,6 @@
           <w:p>
             <w:pPr>
               <w:jc w:val="center"/>
-              <w:spacing w:before="0" w:after="0" w:line="240" w:lineRule="auto"/>
               <w:rPr>
                 <w:rFonts w:ascii="Times New Roman" w:hAnsi="Times New Roman"/>
                 <w:sz w:val="14"/>
@@ -3658,7 +3612,6 @@
           <w:p>
             <w:pPr>
               <w:jc w:val="center"/>
-              <w:spacing w:before="0" w:after="0" w:line="240" w:lineRule="auto"/>
               <w:rPr>
                 <w:rFonts w:ascii="Times New Roman" w:hAnsi="Times New Roman"/>
                 <w:sz w:val="14"/>
@@ -3695,7 +3648,6 @@
           <w:p>
             <w:pPr>
               <w:jc w:val="center"/>
-              <w:spacing w:before="0" w:after="0" w:line="240" w:lineRule="auto"/>
               <w:rPr>
                 <w:rFonts w:ascii="Times New Roman" w:hAnsi="Times New Roman"/>
                 <w:sz w:val="14"/>
@@ -3731,7 +3683,6 @@
           <w:p>
             <w:pPr>
               <w:jc w:val="center"/>
-              <w:spacing w:before="0" w:after="0" w:line="240" w:lineRule="auto"/>
               <w:rPr>
                 <w:rFonts w:ascii="Times New Roman" w:hAnsi="Times New Roman"/>
                 <w:sz w:val="14"/>
@@ -3768,7 +3719,6 @@
           <w:p>
             <w:pPr>
               <w:jc w:val="center"/>
-              <w:spacing w:before="0" w:after="0" w:line="240" w:lineRule="auto"/>
               <w:rPr>
                 <w:rFonts w:ascii="Times New Roman" w:hAnsi="Times New Roman"/>
                 <w:sz w:val="14"/>
@@ -3804,7 +3754,6 @@
           <w:p>
             <w:pPr>
               <w:jc w:val="center"/>
-              <w:spacing w:before="0" w:after="0" w:line="240" w:lineRule="auto"/>
               <w:rPr>
                 <w:rFonts w:ascii="Times New Roman" w:hAnsi="Times New Roman"/>
                 <w:sz w:val="14"/>
@@ -3840,7 +3789,6 @@
           <w:p>
             <w:pPr>
               <w:jc w:val="center"/>
-              <w:spacing w:before="0" w:after="0" w:line="240" w:lineRule="auto"/>
               <w:rPr>
                 <w:rFonts w:ascii="Times New Roman" w:hAnsi="Times New Roman"/>
                 <w:sz w:val="14"/>
@@ -3877,7 +3825,6 @@
           <w:p>
             <w:pPr>
               <w:jc w:val="center"/>
-              <w:spacing w:before="0" w:after="0" w:line="240" w:lineRule="auto"/>
               <w:rPr>
                 <w:rFonts w:ascii="Times New Roman" w:hAnsi="Times New Roman"/>
                 <w:sz w:val="14"/>
@@ -3998,7 +3945,6 @@
           <w:p>
             <w:pPr>
               <w:jc w:val="center"/>
-              <w:spacing w:before="0" w:after="0" w:line="240" w:lineRule="auto"/>
               <w:rPr>
                 <w:rFonts w:ascii="Times New Roman" w:hAnsi="Times New Roman"/>
                 <w:sz w:val="14"/>
@@ -4029,7 +3975,6 @@
           <w:p>
             <w:pPr>
               <w:jc w:val="center"/>
-              <w:spacing w:before="0" w:after="0" w:line="240" w:lineRule="auto"/>
               <w:rPr>
                 <w:rFonts w:ascii="Times New Roman" w:hAnsi="Times New Roman"/>
                 <w:sz w:val="14"/>
@@ -4061,7 +4006,6 @@
           <w:p>
             <w:pPr>
               <w:jc w:val="center"/>
-              <w:spacing w:before="0" w:after="0" w:line="240" w:lineRule="auto"/>
               <w:rPr>
                 <w:rFonts w:ascii="Times New Roman" w:hAnsi="Times New Roman"/>
                 <w:sz w:val="14"/>
@@ -4092,7 +4036,6 @@
           <w:p>
             <w:pPr>
               <w:jc w:val="center"/>
-              <w:spacing w:before="0" w:after="0" w:line="240" w:lineRule="auto"/>
               <w:rPr>
                 <w:rFonts w:ascii="Times New Roman" w:hAnsi="Times New Roman"/>
                 <w:sz w:val="14"/>
@@ -4123,14 +4066,13 @@
           <w:p>
             <w:pPr>
               <w:jc w:val="center"/>
-              <w:spacing w:before="0" w:after="0" w:line="240" w:lineRule="auto"/>
-              <w:rPr>
-                <w:rFonts w:ascii="Times New Roman" w:hAnsi="Times New Roman"/>
-                <w:sz w:val="14"/>
-                <w:szCs w:val="14"/>
-              </w:rPr>
-            </w:pPr>
-            <w:hyperlink r:id="rId9" w:history="1">
+              <w:rPr>
+                <w:rFonts w:ascii="Times New Roman" w:hAnsi="Times New Roman"/>
+                <w:sz w:val="14"/>
+                <w:szCs w:val="14"/>
+              </w:rPr>
+            </w:pPr>
+            <w:hyperlink r:id="rId7" w:anchor="TestDetails" w:history="1">
               <w:r>
                 <w:rPr>
                   <w:rFonts w:ascii="Times New Roman" w:hAnsi="Times New Roman"/>
@@ -4158,8 +4100,8 @@
           </w:tcPr>
           <w:p>
             <w:pPr>
-              <w:jc w:val="center"/>
-              <w:spacing w:before="0" w:after="0" w:line="220" w:lineRule="auto"/>
+              <w:spacing w:line="220" w:lineRule="auto"/>
+              <w:jc w:val="center"/>
               <w:rPr>
                 <w:rFonts w:ascii="Times New Roman" w:hAnsi="Times New Roman"/>
                 <w:sz w:val="13"/>
@@ -4201,7 +4143,6 @@
           <w:p>
             <w:pPr>
               <w:jc w:val="center"/>
-              <w:spacing w:before="0" w:after="0" w:line="240" w:lineRule="auto"/>
               <w:rPr>
                 <w:rFonts w:ascii="Times New Roman" w:hAnsi="Times New Roman"/>
                 <w:sz w:val="14"/>
@@ -4322,7 +4263,6 @@
           <w:p>
             <w:pPr>
               <w:jc w:val="center"/>
-              <w:spacing w:before="0" w:after="0" w:line="240" w:lineRule="auto"/>
               <w:rPr>
                 <w:rFonts w:ascii="Times New Roman" w:hAnsi="Times New Roman"/>
                 <w:sz w:val="14"/>
@@ -4353,7 +4293,6 @@
           <w:p>
             <w:pPr>
               <w:jc w:val="center"/>
-              <w:spacing w:before="0" w:after="0" w:line="240" w:lineRule="auto"/>
               <w:rPr>
                 <w:rFonts w:ascii="Times New Roman" w:hAnsi="Times New Roman"/>
                 <w:sz w:val="14"/>
@@ -4385,7 +4324,6 @@
           <w:p>
             <w:pPr>
               <w:jc w:val="center"/>
-              <w:spacing w:before="0" w:after="0" w:line="240" w:lineRule="auto"/>
               <w:rPr>
                 <w:rFonts w:ascii="Times New Roman" w:hAnsi="Times New Roman"/>
                 <w:sz w:val="14"/>
@@ -4416,7 +4354,6 @@
           <w:p>
             <w:pPr>
               <w:jc w:val="center"/>
-              <w:spacing w:before="0" w:after="0" w:line="240" w:lineRule="auto"/>
               <w:rPr>
                 <w:rFonts w:ascii="Times New Roman" w:hAnsi="Times New Roman"/>
                 <w:sz w:val="14"/>
@@ -4447,7 +4384,6 @@
           <w:p>
             <w:pPr>
               <w:jc w:val="center"/>
-              <w:spacing w:before="0" w:after="0" w:line="240" w:lineRule="auto"/>
               <w:rPr>
                 <w:rFonts w:ascii="Times New Roman" w:hAnsi="Times New Roman"/>
                 <w:sz w:val="14"/>
@@ -4479,7 +4415,6 @@
           <w:p>
             <w:pPr>
               <w:jc w:val="center"/>
-              <w:spacing w:before="0" w:after="0" w:line="240" w:lineRule="auto"/>
               <w:rPr>
                 <w:rFonts w:ascii="Times New Roman" w:hAnsi="Times New Roman"/>
                 <w:sz w:val="14"/>
@@ -4510,7 +4445,6 @@
           <w:p>
             <w:pPr>
               <w:jc w:val="center"/>
-              <w:spacing w:before="0" w:after="0" w:line="240" w:lineRule="auto"/>
               <w:rPr>
                 <w:rFonts w:ascii="Times New Roman" w:hAnsi="Times New Roman"/>
                 <w:sz w:val="14"/>
@@ -4596,15 +4530,15 @@
         <w:gridCol w:w="990"/>
         <w:gridCol w:w="128"/>
         <w:gridCol w:w="652"/>
-        <w:gridCol w:w="1172"/>
-        <w:gridCol w:w="987"/>
-        <w:gridCol w:w="102"/>
+        <w:gridCol w:w="1165"/>
+        <w:gridCol w:w="974"/>
+        <w:gridCol w:w="100"/>
         <w:gridCol w:w="670"/>
-        <w:gridCol w:w="76"/>
-        <w:gridCol w:w="1337"/>
-        <w:gridCol w:w="1374"/>
-        <w:gridCol w:w="1291"/>
-        <w:gridCol w:w="41"/>
+        <w:gridCol w:w="75"/>
+        <w:gridCol w:w="1322"/>
+        <w:gridCol w:w="1361"/>
+        <w:gridCol w:w="1343"/>
+        <w:gridCol w:w="40"/>
         <w:gridCol w:w="520"/>
       </w:tblGrid>
       <w:tr>
@@ -5035,7 +4969,6 @@
           <w:p>
             <w:pPr>
               <w:jc w:val="center"/>
-              <w:spacing w:before="0" w:after="0" w:line="240" w:lineRule="auto"/>
               <w:rPr>
                 <w:rFonts w:ascii="Times New Roman" w:hAnsi="Times New Roman"/>
                 <w:sz w:val="14"/>
@@ -5072,7 +5005,6 @@
           <w:p>
             <w:pPr>
               <w:jc w:val="center"/>
-              <w:spacing w:before="0" w:after="0" w:line="240" w:lineRule="auto"/>
               <w:rPr>
                 <w:rFonts w:ascii="Times New Roman" w:hAnsi="Times New Roman"/>
                 <w:sz w:val="14"/>
@@ -5108,7 +5040,6 @@
           <w:p>
             <w:pPr>
               <w:jc w:val="center"/>
-              <w:spacing w:before="0" w:after="0" w:line="240" w:lineRule="auto"/>
               <w:rPr>
                 <w:rFonts w:ascii="Times New Roman" w:hAnsi="Times New Roman"/>
                 <w:sz w:val="14"/>
@@ -5145,7 +5076,6 @@
           <w:p>
             <w:pPr>
               <w:jc w:val="center"/>
-              <w:spacing w:before="0" w:after="0" w:line="240" w:lineRule="auto"/>
               <w:rPr>
                 <w:rFonts w:ascii="Times New Roman" w:hAnsi="Times New Roman"/>
                 <w:sz w:val="14"/>
@@ -5181,7 +5111,6 @@
           <w:p>
             <w:pPr>
               <w:jc w:val="center"/>
-              <w:spacing w:before="0" w:after="0" w:line="240" w:lineRule="auto"/>
               <w:rPr>
                 <w:rFonts w:ascii="Times New Roman" w:hAnsi="Times New Roman"/>
                 <w:sz w:val="14"/>
@@ -5217,7 +5146,6 @@
           <w:p>
             <w:pPr>
               <w:jc w:val="center"/>
-              <w:spacing w:before="0" w:after="0" w:line="240" w:lineRule="auto"/>
               <w:rPr>
                 <w:rFonts w:ascii="Times New Roman" w:hAnsi="Times New Roman"/>
                 <w:sz w:val="14"/>
@@ -5254,7 +5182,6 @@
           <w:p>
             <w:pPr>
               <w:jc w:val="center"/>
-              <w:spacing w:before="0" w:after="0" w:line="240" w:lineRule="auto"/>
               <w:rPr>
                 <w:rFonts w:ascii="Times New Roman" w:hAnsi="Times New Roman"/>
                 <w:sz w:val="14"/>
@@ -5358,7 +5285,6 @@
           <w:p>
             <w:pPr>
               <w:jc w:val="center"/>
-              <w:spacing w:before="0" w:after="0" w:line="240" w:lineRule="auto"/>
               <w:rPr>
                 <w:rFonts w:ascii="Times New Roman" w:hAnsi="Times New Roman"/>
                 <w:sz w:val="14"/>
@@ -5395,7 +5321,6 @@
           <w:p>
             <w:pPr>
               <w:jc w:val="center"/>
-              <w:spacing w:before="0" w:after="0" w:line="240" w:lineRule="auto"/>
               <w:rPr>
                 <w:rFonts w:ascii="Times New Roman" w:hAnsi="Times New Roman"/>
                 <w:sz w:val="14"/>
@@ -5431,7 +5356,6 @@
           <w:p>
             <w:pPr>
               <w:jc w:val="center"/>
-              <w:spacing w:before="0" w:after="0" w:line="240" w:lineRule="auto"/>
               <w:rPr>
                 <w:rFonts w:ascii="Times New Roman" w:hAnsi="Times New Roman"/>
                 <w:sz w:val="14"/>
@@ -5468,7 +5392,6 @@
           <w:p>
             <w:pPr>
               <w:jc w:val="center"/>
-              <w:spacing w:before="0" w:after="0" w:line="240" w:lineRule="auto"/>
               <w:rPr>
                 <w:rFonts w:ascii="Times New Roman" w:hAnsi="Times New Roman"/>
                 <w:sz w:val="14"/>
@@ -5504,7 +5427,6 @@
           <w:p>
             <w:pPr>
               <w:jc w:val="center"/>
-              <w:spacing w:before="0" w:after="0" w:line="240" w:lineRule="auto"/>
               <w:rPr>
                 <w:rFonts w:ascii="Times New Roman" w:hAnsi="Times New Roman"/>
                 <w:sz w:val="14"/>
@@ -5540,7 +5462,6 @@
           <w:p>
             <w:pPr>
               <w:jc w:val="center"/>
-              <w:spacing w:before="0" w:after="0" w:line="240" w:lineRule="auto"/>
               <w:rPr>
                 <w:rFonts w:ascii="Times New Roman" w:hAnsi="Times New Roman"/>
                 <w:sz w:val="14"/>
@@ -5577,7 +5498,6 @@
           <w:p>
             <w:pPr>
               <w:jc w:val="center"/>
-              <w:spacing w:before="0" w:after="0" w:line="240" w:lineRule="auto"/>
               <w:rPr>
                 <w:rFonts w:ascii="Times New Roman" w:hAnsi="Times New Roman"/>
                 <w:sz w:val="14"/>
@@ -5681,7 +5601,6 @@
           <w:p>
             <w:pPr>
               <w:jc w:val="center"/>
-              <w:spacing w:before="0" w:after="0" w:line="240" w:lineRule="auto"/>
               <w:rPr>
                 <w:rFonts w:ascii="Times New Roman" w:hAnsi="Times New Roman"/>
                 <w:sz w:val="14"/>
@@ -5718,7 +5637,6 @@
           <w:p>
             <w:pPr>
               <w:jc w:val="center"/>
-              <w:spacing w:before="0" w:after="0" w:line="240" w:lineRule="auto"/>
               <w:rPr>
                 <w:rFonts w:ascii="Times New Roman" w:hAnsi="Times New Roman"/>
                 <w:sz w:val="14"/>
@@ -5754,7 +5672,6 @@
           <w:p>
             <w:pPr>
               <w:jc w:val="center"/>
-              <w:spacing w:before="0" w:after="0" w:line="240" w:lineRule="auto"/>
               <w:rPr>
                 <w:rFonts w:ascii="Times New Roman" w:hAnsi="Times New Roman"/>
                 <w:sz w:val="14"/>
@@ -5791,7 +5708,6 @@
           <w:p>
             <w:pPr>
               <w:jc w:val="center"/>
-              <w:spacing w:before="0" w:after="0" w:line="240" w:lineRule="auto"/>
               <w:rPr>
                 <w:rFonts w:ascii="Times New Roman" w:hAnsi="Times New Roman"/>
                 <w:sz w:val="14"/>
@@ -5827,7 +5743,6 @@
           <w:p>
             <w:pPr>
               <w:jc w:val="center"/>
-              <w:spacing w:before="0" w:after="0" w:line="240" w:lineRule="auto"/>
               <w:rPr>
                 <w:rFonts w:ascii="Times New Roman" w:hAnsi="Times New Roman"/>
                 <w:sz w:val="14"/>
@@ -5863,7 +5778,6 @@
           <w:p>
             <w:pPr>
               <w:jc w:val="center"/>
-              <w:spacing w:before="0" w:after="0" w:line="240" w:lineRule="auto"/>
               <w:rPr>
                 <w:rFonts w:ascii="Times New Roman" w:hAnsi="Times New Roman"/>
                 <w:sz w:val="14"/>
@@ -5900,7 +5814,6 @@
           <w:p>
             <w:pPr>
               <w:jc w:val="center"/>
-              <w:spacing w:before="0" w:after="0" w:line="240" w:lineRule="auto"/>
               <w:rPr>
                 <w:rFonts w:ascii="Times New Roman" w:hAnsi="Times New Roman"/>
                 <w:sz w:val="14"/>
@@ -6040,7 +5953,6 @@
           <w:p>
             <w:pPr>
               <w:jc w:val="center"/>
-              <w:spacing w:before="0" w:after="0" w:line="240" w:lineRule="auto"/>
               <w:rPr>
                 <w:rFonts w:ascii="Times New Roman" w:hAnsi="Times New Roman"/>
                 <w:sz w:val="14"/>
@@ -6077,7 +5989,6 @@
           <w:p>
             <w:pPr>
               <w:jc w:val="center"/>
-              <w:spacing w:before="0" w:after="0" w:line="240" w:lineRule="auto"/>
               <w:rPr>
                 <w:rFonts w:ascii="Times New Roman" w:hAnsi="Times New Roman"/>
                 <w:sz w:val="14"/>
@@ -6113,7 +6024,6 @@
           <w:p>
             <w:pPr>
               <w:jc w:val="center"/>
-              <w:spacing w:before="0" w:after="0" w:line="240" w:lineRule="auto"/>
               <w:rPr>
                 <w:rFonts w:ascii="Times New Roman" w:hAnsi="Times New Roman"/>
                 <w:sz w:val="14"/>
@@ -6150,7 +6060,6 @@
           <w:p>
             <w:pPr>
               <w:jc w:val="center"/>
-              <w:spacing w:before="0" w:after="0" w:line="240" w:lineRule="auto"/>
               <w:rPr>
                 <w:rFonts w:ascii="Times New Roman" w:hAnsi="Times New Roman"/>
                 <w:sz w:val="14"/>
@@ -6186,7 +6095,6 @@
           <w:p>
             <w:pPr>
               <w:jc w:val="center"/>
-              <w:spacing w:before="0" w:after="0" w:line="240" w:lineRule="auto"/>
               <w:rPr>
                 <w:rFonts w:ascii="Times New Roman" w:hAnsi="Times New Roman"/>
                 <w:sz w:val="14"/>
@@ -6222,7 +6130,6 @@
           <w:p>
             <w:pPr>
               <w:jc w:val="center"/>
-              <w:spacing w:before="0" w:after="0" w:line="240" w:lineRule="auto"/>
               <w:rPr>
                 <w:rFonts w:ascii="Times New Roman" w:hAnsi="Times New Roman"/>
                 <w:sz w:val="14"/>
@@ -6259,7 +6166,6 @@
           <w:p>
             <w:pPr>
               <w:jc w:val="center"/>
-              <w:spacing w:before="0" w:after="0" w:line="240" w:lineRule="auto"/>
               <w:rPr>
                 <w:rFonts w:ascii="Times New Roman" w:hAnsi="Times New Roman"/>
                 <w:sz w:val="14"/>
@@ -6377,7 +6283,6 @@
           <w:p>
             <w:pPr>
               <w:jc w:val="center"/>
-              <w:spacing w:before="0" w:after="0" w:line="240" w:lineRule="auto"/>
               <w:rPr>
                 <w:rFonts w:ascii="Times New Roman" w:hAnsi="Times New Roman"/>
                 <w:sz w:val="14"/>
@@ -6414,7 +6319,6 @@
           <w:p>
             <w:pPr>
               <w:jc w:val="center"/>
-              <w:spacing w:before="0" w:after="0" w:line="240" w:lineRule="auto"/>
               <w:rPr>
                 <w:rFonts w:ascii="Times New Roman" w:hAnsi="Times New Roman"/>
                 <w:sz w:val="14"/>
@@ -6450,7 +6354,6 @@
           <w:p>
             <w:pPr>
               <w:jc w:val="center"/>
-              <w:spacing w:before="0" w:after="0" w:line="240" w:lineRule="auto"/>
               <w:rPr>
                 <w:rFonts w:ascii="Times New Roman" w:hAnsi="Times New Roman"/>
                 <w:sz w:val="14"/>
@@ -6487,7 +6390,6 @@
           <w:p>
             <w:pPr>
               <w:jc w:val="center"/>
-              <w:spacing w:before="0" w:after="0" w:line="240" w:lineRule="auto"/>
               <w:rPr>
                 <w:rFonts w:ascii="Times New Roman" w:hAnsi="Times New Roman"/>
                 <w:sz w:val="14"/>
@@ -6523,7 +6425,6 @@
           <w:p>
             <w:pPr>
               <w:jc w:val="center"/>
-              <w:spacing w:before="0" w:after="0" w:line="240" w:lineRule="auto"/>
               <w:rPr>
                 <w:rFonts w:ascii="Times New Roman" w:hAnsi="Times New Roman"/>
                 <w:sz w:val="14"/>
@@ -6559,7 +6460,6 @@
           <w:p>
             <w:pPr>
               <w:jc w:val="center"/>
-              <w:spacing w:before="0" w:after="0" w:line="240" w:lineRule="auto"/>
               <w:rPr>
                 <w:rFonts w:ascii="Times New Roman" w:hAnsi="Times New Roman"/>
                 <w:sz w:val="14"/>
@@ -6596,7 +6496,6 @@
           <w:p>
             <w:pPr>
               <w:jc w:val="center"/>
-              <w:spacing w:before="0" w:after="0" w:line="240" w:lineRule="auto"/>
               <w:rPr>
                 <w:rFonts w:ascii="Times New Roman" w:hAnsi="Times New Roman"/>
                 <w:sz w:val="14"/>
@@ -6700,7 +6599,6 @@
           <w:p>
             <w:pPr>
               <w:jc w:val="center"/>
-              <w:spacing w:before="0" w:after="0" w:line="240" w:lineRule="auto"/>
               <w:rPr>
                 <w:rFonts w:ascii="Times New Roman" w:hAnsi="Times New Roman"/>
                 <w:sz w:val="14"/>
@@ -6737,7 +6635,6 @@
           <w:p>
             <w:pPr>
               <w:jc w:val="center"/>
-              <w:spacing w:before="0" w:after="0" w:line="240" w:lineRule="auto"/>
               <w:rPr>
                 <w:rFonts w:ascii="Times New Roman" w:hAnsi="Times New Roman"/>
                 <w:sz w:val="14"/>
@@ -6773,7 +6670,6 @@
           <w:p>
             <w:pPr>
               <w:jc w:val="center"/>
-              <w:spacing w:before="0" w:after="0" w:line="240" w:lineRule="auto"/>
               <w:rPr>
                 <w:rFonts w:ascii="Times New Roman" w:hAnsi="Times New Roman"/>
                 <w:sz w:val="14"/>
@@ -6810,7 +6706,6 @@
           <w:p>
             <w:pPr>
               <w:jc w:val="center"/>
-              <w:spacing w:before="0" w:after="0" w:line="240" w:lineRule="auto"/>
               <w:rPr>
                 <w:rFonts w:ascii="Times New Roman" w:hAnsi="Times New Roman"/>
                 <w:sz w:val="14"/>
@@ -6846,7 +6741,6 @@
           <w:p>
             <w:pPr>
               <w:jc w:val="center"/>
-              <w:spacing w:before="0" w:after="0" w:line="240" w:lineRule="auto"/>
               <w:rPr>
                 <w:rFonts w:ascii="Times New Roman" w:hAnsi="Times New Roman"/>
                 <w:sz w:val="14"/>
@@ -6882,7 +6776,6 @@
           <w:p>
             <w:pPr>
               <w:jc w:val="center"/>
-              <w:spacing w:before="0" w:after="0" w:line="240" w:lineRule="auto"/>
               <w:rPr>
                 <w:rFonts w:ascii="Times New Roman" w:hAnsi="Times New Roman"/>
                 <w:sz w:val="14"/>
@@ -6919,7 +6812,6 @@
           <w:p>
             <w:pPr>
               <w:jc w:val="center"/>
-              <w:spacing w:before="0" w:after="0" w:line="240" w:lineRule="auto"/>
               <w:rPr>
                 <w:rFonts w:ascii="Times New Roman" w:hAnsi="Times New Roman"/>
                 <w:sz w:val="14"/>
@@ -7023,7 +6915,6 @@
           <w:p>
             <w:pPr>
               <w:jc w:val="center"/>
-              <w:spacing w:before="0" w:after="0" w:line="240" w:lineRule="auto"/>
               <w:rPr>
                 <w:rFonts w:ascii="Times New Roman" w:hAnsi="Times New Roman"/>
                 <w:sz w:val="14"/>
@@ -7060,7 +6951,6 @@
           <w:p>
             <w:pPr>
               <w:jc w:val="center"/>
-              <w:spacing w:before="0" w:after="0" w:line="240" w:lineRule="auto"/>
               <w:rPr>
                 <w:rFonts w:ascii="Times New Roman" w:hAnsi="Times New Roman"/>
                 <w:sz w:val="14"/>
@@ -7096,7 +6986,6 @@
           <w:p>
             <w:pPr>
               <w:jc w:val="center"/>
-              <w:spacing w:before="0" w:after="0" w:line="240" w:lineRule="auto"/>
               <w:rPr>
                 <w:rFonts w:ascii="Times New Roman" w:hAnsi="Times New Roman"/>
                 <w:sz w:val="14"/>
@@ -7133,7 +7022,6 @@
           <w:p>
             <w:pPr>
               <w:jc w:val="center"/>
-              <w:spacing w:before="0" w:after="0" w:line="240" w:lineRule="auto"/>
               <w:rPr>
                 <w:rFonts w:ascii="Times New Roman" w:hAnsi="Times New Roman"/>
                 <w:sz w:val="14"/>
@@ -7169,7 +7057,6 @@
           <w:p>
             <w:pPr>
               <w:jc w:val="center"/>
-              <w:spacing w:before="0" w:after="0" w:line="240" w:lineRule="auto"/>
               <w:rPr>
                 <w:rFonts w:ascii="Times New Roman" w:hAnsi="Times New Roman"/>
                 <w:sz w:val="14"/>
@@ -7205,7 +7092,6 @@
           <w:p>
             <w:pPr>
               <w:jc w:val="center"/>
-              <w:spacing w:before="0" w:after="0" w:line="240" w:lineRule="auto"/>
               <w:rPr>
                 <w:rFonts w:ascii="Times New Roman" w:hAnsi="Times New Roman"/>
                 <w:sz w:val="14"/>
@@ -7242,7 +7128,6 @@
           <w:p>
             <w:pPr>
               <w:jc w:val="center"/>
-              <w:spacing w:before="0" w:after="0" w:line="240" w:lineRule="auto"/>
               <w:rPr>
                 <w:rFonts w:ascii="Times New Roman" w:hAnsi="Times New Roman"/>
                 <w:sz w:val="14"/>
@@ -7346,7 +7231,6 @@
           <w:p>
             <w:pPr>
               <w:jc w:val="center"/>
-              <w:spacing w:before="0" w:after="0" w:line="240" w:lineRule="auto"/>
               <w:rPr>
                 <w:rFonts w:ascii="Times New Roman" w:hAnsi="Times New Roman"/>
                 <w:sz w:val="14"/>
@@ -7383,7 +7267,6 @@
           <w:p>
             <w:pPr>
               <w:jc w:val="center"/>
-              <w:spacing w:before="0" w:after="0" w:line="240" w:lineRule="auto"/>
               <w:rPr>
                 <w:rFonts w:ascii="Times New Roman" w:hAnsi="Times New Roman"/>
                 <w:sz w:val="14"/>
@@ -7419,7 +7302,6 @@
           <w:p>
             <w:pPr>
               <w:jc w:val="center"/>
-              <w:spacing w:before="0" w:after="0" w:line="240" w:lineRule="auto"/>
               <w:rPr>
                 <w:rFonts w:ascii="Times New Roman" w:hAnsi="Times New Roman"/>
                 <w:sz w:val="14"/>
@@ -7456,7 +7338,6 @@
           <w:p>
             <w:pPr>
               <w:jc w:val="center"/>
-              <w:spacing w:before="0" w:after="0" w:line="240" w:lineRule="auto"/>
               <w:rPr>
                 <w:rFonts w:ascii="Times New Roman" w:hAnsi="Times New Roman"/>
                 <w:sz w:val="14"/>
@@ -7492,7 +7373,6 @@
           <w:p>
             <w:pPr>
               <w:jc w:val="center"/>
-              <w:spacing w:before="0" w:after="0" w:line="240" w:lineRule="auto"/>
               <w:rPr>
                 <w:rFonts w:ascii="Times New Roman" w:hAnsi="Times New Roman"/>
                 <w:sz w:val="14"/>
@@ -7528,7 +7408,6 @@
           <w:p>
             <w:pPr>
               <w:jc w:val="center"/>
-              <w:spacing w:before="0" w:after="0" w:line="240" w:lineRule="auto"/>
               <w:rPr>
                 <w:rFonts w:ascii="Times New Roman" w:hAnsi="Times New Roman"/>
                 <w:sz w:val="14"/>
@@ -7565,7 +7444,6 @@
           <w:p>
             <w:pPr>
               <w:jc w:val="center"/>
-              <w:spacing w:before="0" w:after="0" w:line="240" w:lineRule="auto"/>
               <w:rPr>
                 <w:rFonts w:ascii="Times New Roman" w:hAnsi="Times New Roman"/>
                 <w:sz w:val="14"/>
@@ -7669,7 +7547,6 @@
           <w:p>
             <w:pPr>
               <w:jc w:val="center"/>
-              <w:spacing w:before="0" w:after="0" w:line="240" w:lineRule="auto"/>
               <w:rPr>
                 <w:rFonts w:ascii="Times New Roman" w:hAnsi="Times New Roman"/>
                 <w:sz w:val="14"/>
@@ -7706,7 +7583,6 @@
           <w:p>
             <w:pPr>
               <w:jc w:val="center"/>
-              <w:spacing w:before="0" w:after="0" w:line="240" w:lineRule="auto"/>
               <w:rPr>
                 <w:rFonts w:ascii="Times New Roman" w:hAnsi="Times New Roman"/>
                 <w:sz w:val="14"/>
@@ -7742,7 +7618,6 @@
           <w:p>
             <w:pPr>
               <w:jc w:val="center"/>
-              <w:spacing w:before="0" w:after="0" w:line="240" w:lineRule="auto"/>
               <w:rPr>
                 <w:rFonts w:ascii="Times New Roman" w:hAnsi="Times New Roman"/>
                 <w:sz w:val="14"/>
@@ -7779,7 +7654,6 @@
           <w:p>
             <w:pPr>
               <w:jc w:val="center"/>
-              <w:spacing w:before="0" w:after="0" w:line="240" w:lineRule="auto"/>
               <w:rPr>
                 <w:rFonts w:ascii="Times New Roman" w:hAnsi="Times New Roman"/>
                 <w:sz w:val="14"/>
@@ -7815,7 +7689,6 @@
           <w:p>
             <w:pPr>
               <w:jc w:val="center"/>
-              <w:spacing w:before="0" w:after="0" w:line="240" w:lineRule="auto"/>
               <w:rPr>
                 <w:rFonts w:ascii="Times New Roman" w:hAnsi="Times New Roman"/>
                 <w:sz w:val="14"/>
@@ -7851,7 +7724,6 @@
           <w:p>
             <w:pPr>
               <w:jc w:val="center"/>
-              <w:spacing w:before="0" w:after="0" w:line="240" w:lineRule="auto"/>
               <w:rPr>
                 <w:rFonts w:ascii="Times New Roman" w:hAnsi="Times New Roman"/>
                 <w:sz w:val="14"/>
@@ -7888,7 +7760,6 @@
           <w:p>
             <w:pPr>
               <w:jc w:val="center"/>
-              <w:spacing w:before="0" w:after="0" w:line="240" w:lineRule="auto"/>
               <w:rPr>
                 <w:rFonts w:ascii="Times New Roman" w:hAnsi="Times New Roman"/>
                 <w:sz w:val="14"/>
@@ -8009,7 +7880,6 @@
           <w:p>
             <w:pPr>
               <w:jc w:val="center"/>
-              <w:spacing w:before="0" w:after="0" w:line="240" w:lineRule="auto"/>
               <w:rPr>
                 <w:rFonts w:ascii="Times New Roman" w:hAnsi="Times New Roman"/>
                 <w:sz w:val="14"/>
@@ -8040,7 +7910,6 @@
           <w:p>
             <w:pPr>
               <w:jc w:val="center"/>
-              <w:spacing w:before="0" w:after="0" w:line="240" w:lineRule="auto"/>
               <w:rPr>
                 <w:rFonts w:ascii="Times New Roman" w:hAnsi="Times New Roman"/>
                 <w:sz w:val="14"/>
@@ -8072,7 +7941,6 @@
           <w:p>
             <w:pPr>
               <w:jc w:val="center"/>
-              <w:spacing w:before="0" w:after="0" w:line="240" w:lineRule="auto"/>
               <w:rPr>
                 <w:rFonts w:ascii="Times New Roman" w:hAnsi="Times New Roman"/>
                 <w:sz w:val="14"/>
@@ -8103,7 +7971,6 @@
           <w:p>
             <w:pPr>
               <w:jc w:val="center"/>
-              <w:spacing w:before="0" w:after="0" w:line="240" w:lineRule="auto"/>
               <w:rPr>
                 <w:rFonts w:ascii="Times New Roman" w:hAnsi="Times New Roman"/>
                 <w:sz w:val="14"/>
@@ -8134,14 +8001,13 @@
           <w:p>
             <w:pPr>
               <w:jc w:val="center"/>
-              <w:spacing w:before="0" w:after="0" w:line="240" w:lineRule="auto"/>
-              <w:rPr>
-                <w:rFonts w:ascii="Times New Roman" w:hAnsi="Times New Roman"/>
-                <w:sz w:val="14"/>
-                <w:szCs w:val="14"/>
-              </w:rPr>
-            </w:pPr>
-            <w:hyperlink r:id="rId10" w:history="1">
+              <w:rPr>
+                <w:rFonts w:ascii="Times New Roman" w:hAnsi="Times New Roman"/>
+                <w:sz w:val="14"/>
+                <w:szCs w:val="14"/>
+              </w:rPr>
+            </w:pPr>
+            <w:hyperlink r:id="rId8" w:history="1">
               <w:r>
                 <w:rPr>
                   <w:rFonts w:ascii="Times New Roman" w:hAnsi="Times New Roman"/>
@@ -8170,7 +8036,6 @@
           <w:p>
             <w:pPr>
               <w:jc w:val="center"/>
-              <w:spacing w:before="0" w:after="0" w:line="240" w:lineRule="auto"/>
               <w:rPr>
                 <w:rFonts w:ascii="Times New Roman" w:hAnsi="Times New Roman"/>
                 <w:sz w:val="13"/>
@@ -8190,8 +8055,8 @@
           </w:p>
           <w:p>
             <w:pPr>
-              <w:jc w:val="center"/>
-              <w:spacing w:before="0" w:after="0" w:line="180" w:lineRule="auto"/>
+              <w:spacing w:line="180" w:lineRule="auto"/>
+              <w:jc w:val="center"/>
               <w:rPr>
                 <w:rFonts w:ascii="Times New Roman" w:hAnsi="Times New Roman"/>
                 <w:sz w:val="13"/>
@@ -8202,7 +8067,6 @@
           <w:p>
             <w:pPr>
               <w:jc w:val="center"/>
-              <w:spacing w:before="0" w:after="0" w:line="240" w:lineRule="auto"/>
               <w:rPr>
                 <w:rFonts w:ascii="Times New Roman" w:hAnsi="Times New Roman"/>
                 <w:sz w:val="13"/>
@@ -8235,7 +8099,6 @@
           <w:p>
             <w:pPr>
               <w:jc w:val="center"/>
-              <w:spacing w:before="0" w:after="0" w:line="240" w:lineRule="auto"/>
               <w:rPr>
                 <w:rFonts w:ascii="Times New Roman" w:hAnsi="Times New Roman"/>
                 <w:sz w:val="14"/>
@@ -8356,7 +8219,6 @@
           <w:p>
             <w:pPr>
               <w:jc w:val="center"/>
-              <w:spacing w:before="0" w:after="0" w:line="240" w:lineRule="auto"/>
               <w:rPr>
                 <w:rFonts w:ascii="Times New Roman" w:hAnsi="Times New Roman"/>
                 <w:sz w:val="14"/>
@@ -8387,7 +8249,6 @@
           <w:p>
             <w:pPr>
               <w:jc w:val="center"/>
-              <w:spacing w:before="0" w:after="0" w:line="240" w:lineRule="auto"/>
               <w:rPr>
                 <w:rFonts w:ascii="Times New Roman" w:hAnsi="Times New Roman"/>
                 <w:sz w:val="14"/>
@@ -8419,7 +8280,6 @@
           <w:p>
             <w:pPr>
               <w:jc w:val="center"/>
-              <w:spacing w:before="0" w:after="0" w:line="240" w:lineRule="auto"/>
               <w:rPr>
                 <w:rFonts w:ascii="Times New Roman" w:hAnsi="Times New Roman"/>
                 <w:sz w:val="14"/>
@@ -8450,7 +8310,6 @@
           <w:p>
             <w:pPr>
               <w:jc w:val="center"/>
-              <w:spacing w:before="0" w:after="0" w:line="240" w:lineRule="auto"/>
               <w:rPr>
                 <w:rFonts w:ascii="Times New Roman" w:hAnsi="Times New Roman"/>
                 <w:sz w:val="14"/>
@@ -8481,7 +8340,6 @@
           <w:p>
             <w:pPr>
               <w:jc w:val="center"/>
-              <w:spacing w:before="0" w:after="0" w:line="240" w:lineRule="auto"/>
               <w:rPr>
                 <w:rFonts w:ascii="Times New Roman" w:hAnsi="Times New Roman"/>
                 <w:sz w:val="14"/>
@@ -8513,7 +8371,6 @@
           <w:p>
             <w:pPr>
               <w:jc w:val="center"/>
-              <w:spacing w:before="0" w:after="0" w:line="240" w:lineRule="auto"/>
               <w:rPr>
                 <w:rFonts w:ascii="Times New Roman" w:hAnsi="Times New Roman"/>
                 <w:sz w:val="14"/>
@@ -8544,7 +8401,6 @@
           <w:p>
             <w:pPr>
               <w:jc w:val="center"/>
-              <w:spacing w:before="0" w:after="0" w:line="240" w:lineRule="auto"/>
               <w:rPr>
                 <w:rFonts w:ascii="Times New Roman" w:hAnsi="Times New Roman"/>
                 <w:sz w:val="14"/>

</xml_diff>